<commit_message>
Update workshop notebooks and instructions
Co-authored-by: Cursor <cursoragent@cursor.com>
</commit_message>
<xml_diff>
--- a/Workshop-Instructions.docx
+++ b/Workshop-Instructions.docx
@@ -15,8 +15,8 @@
           <w:noProof/>
         </w:rPr>
         <w:drawing>
-          <wp:inline distT="19050" distB="19050" distL="19050" distR="19050" wp14:anchorId="59A07FDF" wp14:editId="7D56623A">
-            <wp:extent cx="2862072" cy="812338"/>
+          <wp:inline distT="19050" distB="19050" distL="19050" distR="19050" wp14:anchorId="59A07FDF" wp14:editId="2018EC3C">
+            <wp:extent cx="1972236" cy="559777"/>
             <wp:effectExtent l="0" t="0" r="0" b="0"/>
             <wp:docPr id="1327504989" name="image1.png" descr="CGA_logo_2025.png"/>
             <wp:cNvGraphicFramePr/>
@@ -37,7 +37,7 @@
                   <pic:spPr>
                     <a:xfrm>
                       <a:off x="0" y="0"/>
-                      <a:ext cx="2862072" cy="812338"/>
+                      <a:ext cx="2016765" cy="572416"/>
                     </a:xfrm>
                     <a:prstGeom prst="rect">
                       <a:avLst/>
@@ -53,36 +53,26 @@
     </w:p>
     <w:p>
       <w:pPr>
-        <w:rPr>
-          <w:rFonts w:ascii="Times New Roman" w:hAnsi="Times New Roman" w:cs="Times New Roman"/>
-        </w:rPr>
-      </w:pPr>
-      <w:r>
-        <w:rPr>
-          <w:rStyle w:val="Strong"/>
-          <w:rFonts w:ascii="Times New Roman" w:hAnsi="Times New Roman" w:cs="Times New Roman"/>
-        </w:rPr>
-        <w:t>Title:</w:t>
-      </w:r>
+        <w:jc w:val="center"/>
+        <w:rPr>
+          <w:rFonts w:ascii="Times New Roman" w:hAnsi="Times New Roman" w:cs="Times New Roman"/>
+        </w:rPr>
+      </w:pPr>
       <w:r>
         <w:rPr>
           <w:rFonts w:ascii="Times New Roman" w:hAnsi="Times New Roman" w:cs="Times New Roman"/>
           <w:b/>
           <w:bCs/>
-        </w:rPr>
-        <w:t xml:space="preserve"> </w:t>
-      </w:r>
-      <w:r>
-        <w:rPr>
-          <w:rFonts w:ascii="Times New Roman" w:hAnsi="Times New Roman" w:cs="Times New Roman"/>
-          <w:b/>
-          <w:bCs/>
+          <w:sz w:val="32"/>
+          <w:szCs w:val="32"/>
         </w:rPr>
         <w:t>Using Python for Geospatial Analysis and Visualization</w:t>
       </w:r>
       <w:r>
         <w:rPr>
           <w:rFonts w:ascii="Times New Roman" w:hAnsi="Times New Roman" w:cs="Times New Roman"/>
+          <w:sz w:val="28"/>
+          <w:szCs w:val="28"/>
         </w:rPr>
         <w:br/>
       </w:r>
@@ -155,12 +145,26 @@
         <w:rPr>
           <w:rFonts w:ascii="Times New Roman" w:hAnsi="Times New Roman" w:cs="Times New Roman"/>
         </w:rPr>
-        <w:t xml:space="preserve"> 1737 Cambridge St., Cambridge, MA, CGIS </w:t>
+        <w:t xml:space="preserve"> </w:t>
+      </w:r>
+      <w:r>
+        <w:rPr>
+          <w:rFonts w:ascii="Times New Roman" w:hAnsi="Times New Roman" w:cs="Times New Roman"/>
+          <w:i/>
+          <w:iCs/>
+          <w:sz w:val="22"/>
+          <w:szCs w:val="22"/>
+        </w:rPr>
+        <w:t xml:space="preserve">1737 Cambridge St., Cambridge, MA, CGIS </w:t>
       </w:r>
       <w:proofErr w:type="spellStart"/>
       <w:r>
         <w:rPr>
           <w:rFonts w:ascii="Times New Roman" w:hAnsi="Times New Roman" w:cs="Times New Roman"/>
+          <w:i/>
+          <w:iCs/>
+          <w:sz w:val="22"/>
+          <w:szCs w:val="22"/>
         </w:rPr>
         <w:t>Knafel</w:t>
       </w:r>
@@ -168,6 +172,10 @@
       <w:r>
         <w:rPr>
           <w:rFonts w:ascii="Times New Roman" w:hAnsi="Times New Roman" w:cs="Times New Roman"/>
+          <w:i/>
+          <w:iCs/>
+          <w:sz w:val="22"/>
+          <w:szCs w:val="22"/>
         </w:rPr>
         <w:t xml:space="preserve"> Building, Room SB-12, Sub-Basement</w:t>
       </w:r>
@@ -183,12 +191,14 @@
           <w:rFonts w:ascii="Times New Roman" w:hAnsi="Times New Roman" w:cs="Times New Roman"/>
           <w:b w:val="0"/>
           <w:bCs w:val="0"/>
+          <w:highlight w:val="red"/>
         </w:rPr>
         <w:t>Zoom:</w:t>
       </w:r>
       <w:r>
         <w:rPr>
           <w:rFonts w:ascii="Times New Roman" w:hAnsi="Times New Roman" w:cs="Times New Roman"/>
+          <w:highlight w:val="red"/>
         </w:rPr>
         <w:t xml:space="preserve"> </w:t>
       </w:r>
@@ -197,6 +207,7 @@
           <w:rPr>
             <w:rStyle w:val="Hyperlink"/>
             <w:rFonts w:ascii="Times New Roman" w:hAnsi="Times New Roman" w:cs="Times New Roman"/>
+            <w:highlight w:val="red"/>
           </w:rPr>
           <w:t>https://harvard.zoom.us/j/2304706732?omn=92517624341</w:t>
         </w:r>
@@ -205,11 +216,28 @@
     <w:p>
       <w:pPr>
         <w:pStyle w:val="NormalWeb"/>
-      </w:pPr>
-      <w:r>
         <w:rPr>
           <w:rStyle w:val="Strong"/>
           <w:rFonts w:eastAsiaTheme="majorEastAsia"/>
+          <w:sz w:val="28"/>
+          <w:szCs w:val="28"/>
+        </w:rPr>
+      </w:pPr>
+    </w:p>
+    <w:p>
+      <w:pPr>
+        <w:pStyle w:val="NormalWeb"/>
+        <w:rPr>
+          <w:sz w:val="28"/>
+          <w:szCs w:val="28"/>
+        </w:rPr>
+      </w:pPr>
+      <w:r>
+        <w:rPr>
+          <w:rStyle w:val="Strong"/>
+          <w:rFonts w:eastAsiaTheme="majorEastAsia"/>
+          <w:sz w:val="28"/>
+          <w:szCs w:val="28"/>
         </w:rPr>
         <w:t>Pre-Workshop Instructions</w:t>
       </w:r>
@@ -237,7 +265,20 @@
         <w:rPr>
           <w:rFonts w:ascii="Times New Roman" w:hAnsi="Times New Roman" w:cs="Times New Roman"/>
         </w:rPr>
-        <w:t xml:space="preserve">Download the GitHub repository for this workshop to your local computer. </w:t>
+        <w:t xml:space="preserve">Download the </w:t>
+      </w:r>
+      <w:r>
+        <w:rPr>
+          <w:rFonts w:ascii="Times New Roman" w:hAnsi="Times New Roman" w:cs="Times New Roman"/>
+          <w:highlight w:val="red"/>
+        </w:rPr>
+        <w:t>GitHub repository</w:t>
+      </w:r>
+      <w:r>
+        <w:rPr>
+          <w:rFonts w:ascii="Times New Roman" w:hAnsi="Times New Roman" w:cs="Times New Roman"/>
+        </w:rPr>
+        <w:t xml:space="preserve"> for this workshop to your local computer. </w:t>
       </w:r>
     </w:p>
     <w:p>
@@ -922,10 +963,10 @@
         </w:rPr>
         <w:lastRenderedPageBreak/>
         <w:drawing>
-          <wp:inline distT="0" distB="0" distL="0" distR="0" wp14:anchorId="58A62F32" wp14:editId="5D1B6C30">
-            <wp:extent cx="5943600" cy="2310765"/>
-            <wp:effectExtent l="0" t="0" r="0" b="635"/>
-            <wp:docPr id="806081642" name="Picture 1" descr="A screenshot of a computer&#10;&#10;AI-generated content may be incorrect."/>
+          <wp:inline distT="0" distB="0" distL="0" distR="0" wp14:anchorId="2209D9AA" wp14:editId="5ACF0849">
+            <wp:extent cx="5943600" cy="2008505"/>
+            <wp:effectExtent l="0" t="0" r="0" b="0"/>
+            <wp:docPr id="389341846" name="Picture 9" descr="A screenshot of a computer&#10;&#10;AI-generated content may be incorrect."/>
             <wp:cNvGraphicFramePr>
               <a:graphicFrameLocks xmlns:a="http://schemas.openxmlformats.org/drawingml/2006/main" noChangeAspect="1"/>
             </wp:cNvGraphicFramePr>
@@ -933,7 +974,7 @@
               <a:graphicData uri="http://schemas.openxmlformats.org/drawingml/2006/picture">
                 <pic:pic xmlns:pic="http://schemas.openxmlformats.org/drawingml/2006/picture">
                   <pic:nvPicPr>
-                    <pic:cNvPr id="806081642" name="Picture 1" descr="A screenshot of a computer&#10;&#10;AI-generated content may be incorrect."/>
+                    <pic:cNvPr id="389341846" name="Picture 9" descr="A screenshot of a computer&#10;&#10;AI-generated content may be incorrect."/>
                     <pic:cNvPicPr/>
                   </pic:nvPicPr>
                   <pic:blipFill>
@@ -951,7 +992,7 @@
                   <pic:spPr>
                     <a:xfrm>
                       <a:off x="0" y="0"/>
-                      <a:ext cx="5943600" cy="2310765"/>
+                      <a:ext cx="5943600" cy="2008505"/>
                     </a:xfrm>
                     <a:prstGeom prst="rect">
                       <a:avLst/>
@@ -1032,28 +1073,28 @@
     </w:p>
     <w:p>
       <w:pPr>
-        <w:pStyle w:val="ListParagraph"/>
-        <w:rPr>
-          <w:rFonts w:ascii="Times New Roman" w:hAnsi="Times New Roman" w:cs="Times New Roman"/>
-        </w:rPr>
-      </w:pPr>
-      <w:r>
-        <w:rPr>
-          <w:rFonts w:ascii="Times New Roman" w:hAnsi="Times New Roman" w:cs="Times New Roman"/>
+        <w:spacing w:before="100" w:beforeAutospacing="1" w:after="100" w:afterAutospacing="1" w:line="240" w:lineRule="auto"/>
+        <w:ind w:left="720"/>
+        <w:rPr>
+          <w:rFonts w:ascii="Times New Roman" w:hAnsi="Times New Roman" w:cs="Times New Roman"/>
+        </w:rPr>
+      </w:pPr>
+      <w:r>
+        <w:rPr>
           <w:noProof/>
         </w:rPr>
         <mc:AlternateContent>
           <mc:Choice Requires="wps">
             <w:drawing>
-              <wp:anchor distT="0" distB="0" distL="114300" distR="114300" simplePos="0" relativeHeight="251672576" behindDoc="0" locked="0" layoutInCell="1" allowOverlap="1" wp14:anchorId="44A9F105" wp14:editId="0433868C">
+              <wp:anchor distT="0" distB="0" distL="114300" distR="114300" simplePos="0" relativeHeight="251672576" behindDoc="0" locked="0" layoutInCell="1" allowOverlap="1" wp14:anchorId="44A9F105" wp14:editId="2E247025">
                 <wp:simplePos x="0" y="0"/>
                 <wp:positionH relativeFrom="column">
                   <wp:posOffset>3750310</wp:posOffset>
                 </wp:positionH>
                 <wp:positionV relativeFrom="paragraph">
-                  <wp:posOffset>1228464</wp:posOffset>
+                  <wp:posOffset>1203064</wp:posOffset>
                 </wp:positionV>
-                <wp:extent cx="973418" cy="196477"/>
+                <wp:extent cx="972820" cy="196215"/>
                 <wp:effectExtent l="12700" t="12700" r="17780" b="6985"/>
                 <wp:wrapNone/>
                 <wp:docPr id="1334923624" name="Rectangle 3"/>
@@ -1065,7 +1106,7 @@
                       <wps:spPr>
                         <a:xfrm>
                           <a:off x="0" y="0"/>
-                          <a:ext cx="973418" cy="196477"/>
+                          <a:ext cx="972820" cy="196215"/>
                         </a:xfrm>
                         <a:prstGeom prst="rect">
                           <a:avLst/>
@@ -1113,7 +1154,7 @@
           </mc:Choice>
           <mc:Fallback>
             <w:pict>
-              <v:rect w14:anchorId="7587A300" id="Rectangle 3" o:spid="_x0000_s1026" style="position:absolute;margin-left:295.3pt;margin-top:96.75pt;width:76.65pt;height:15.45pt;z-index:251672576;visibility:visible;mso-wrap-style:square;mso-width-percent:0;mso-height-percent:0;mso-wrap-distance-left:9pt;mso-wrap-distance-top:0;mso-wrap-distance-right:9pt;mso-wrap-distance-bottom:0;mso-position-horizontal:absolute;mso-position-horizontal-relative:text;mso-position-vertical:absolute;mso-position-vertical-relative:text;mso-width-percent:0;mso-height-percent:0;mso-width-relative:margin;mso-height-relative:margin;v-text-anchor:middle" o:gfxdata="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" filled="f" strokecolor="red" strokeweight="1.5pt"/>
+              <v:rect w14:anchorId="054AD338" id="Rectangle 3" o:spid="_x0000_s1026" style="position:absolute;margin-left:295.3pt;margin-top:94.75pt;width:76.6pt;height:15.45pt;z-index:251672576;visibility:visible;mso-wrap-style:square;mso-width-percent:0;mso-height-percent:0;mso-wrap-distance-left:9pt;mso-wrap-distance-top:0;mso-wrap-distance-right:9pt;mso-wrap-distance-bottom:0;mso-position-horizontal:absolute;mso-position-horizontal-relative:text;mso-position-vertical:absolute;mso-position-vertical-relative:text;mso-width-percent:0;mso-height-percent:0;mso-width-relative:margin;mso-height-relative:margin;v-text-anchor:middle" o:gfxdata="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" filled="f" strokecolor="red" strokeweight="1.5pt"/>
             </w:pict>
           </mc:Fallback>
         </mc:AlternateContent>
@@ -1121,6 +1162,52 @@
       <w:r>
         <w:rPr>
           <w:rFonts w:ascii="Times New Roman" w:hAnsi="Times New Roman" w:cs="Times New Roman"/>
+          <w:noProof/>
+        </w:rPr>
+        <w:drawing>
+          <wp:inline distT="0" distB="0" distL="0" distR="0" wp14:anchorId="4C433A96" wp14:editId="772B7FB4">
+            <wp:extent cx="5943600" cy="2189480"/>
+            <wp:effectExtent l="0" t="0" r="0" b="0"/>
+            <wp:docPr id="1425156448" name="Picture 10" descr="A screenshot of a computer&#10;&#10;AI-generated content may be incorrect."/>
+            <wp:cNvGraphicFramePr>
+              <a:graphicFrameLocks xmlns:a="http://schemas.openxmlformats.org/drawingml/2006/main" noChangeAspect="1"/>
+            </wp:cNvGraphicFramePr>
+            <a:graphic xmlns:a="http://schemas.openxmlformats.org/drawingml/2006/main">
+              <a:graphicData uri="http://schemas.openxmlformats.org/drawingml/2006/picture">
+                <pic:pic xmlns:pic="http://schemas.openxmlformats.org/drawingml/2006/picture">
+                  <pic:nvPicPr>
+                    <pic:cNvPr id="1425156448" name="Picture 10" descr="A screenshot of a computer&#10;&#10;AI-generated content may be incorrect."/>
+                    <pic:cNvPicPr/>
+                  </pic:nvPicPr>
+                  <pic:blipFill>
+                    <a:blip r:embed="rId10" cstate="print">
+                      <a:extLst>
+                        <a:ext uri="{28A0092B-C50C-407E-A947-70E740481C1C}">
+                          <a14:useLocalDpi xmlns:a14="http://schemas.microsoft.com/office/drawing/2010/main" val="0"/>
+                        </a:ext>
+                      </a:extLst>
+                    </a:blip>
+                    <a:stretch>
+                      <a:fillRect/>
+                    </a:stretch>
+                  </pic:blipFill>
+                  <pic:spPr>
+                    <a:xfrm>
+                      <a:off x="0" y="0"/>
+                      <a:ext cx="5943600" cy="2189480"/>
+                    </a:xfrm>
+                    <a:prstGeom prst="rect">
+                      <a:avLst/>
+                    </a:prstGeom>
+                  </pic:spPr>
+                </pic:pic>
+              </a:graphicData>
+            </a:graphic>
+          </wp:inline>
+        </w:drawing>
+      </w:r>
+      <w:r>
+        <w:rPr>
           <w:noProof/>
         </w:rPr>
         <mc:AlternateContent>
@@ -1201,7 +1288,6 @@
       </w:r>
       <w:r>
         <w:rPr>
-          <w:rFonts w:ascii="Times New Roman" w:hAnsi="Times New Roman" w:cs="Times New Roman"/>
           <w:noProof/>
         </w:rPr>
         <mc:AlternateContent>
@@ -1280,53 +1366,6 @@
           </mc:Fallback>
         </mc:AlternateContent>
       </w:r>
-      <w:r>
-        <w:rPr>
-          <w:rFonts w:ascii="Times New Roman" w:hAnsi="Times New Roman" w:cs="Times New Roman"/>
-          <w:noProof/>
-        </w:rPr>
-        <w:drawing>
-          <wp:inline distT="0" distB="0" distL="0" distR="0" wp14:anchorId="5D26FB6F" wp14:editId="3331C36A">
-            <wp:extent cx="5943600" cy="2310130"/>
-            <wp:effectExtent l="0" t="0" r="0" b="1270"/>
-            <wp:docPr id="360484274" name="Picture 5" descr="A screenshot of a computer&#10;&#10;AI-generated content may be incorrect."/>
-            <wp:cNvGraphicFramePr>
-              <a:graphicFrameLocks xmlns:a="http://schemas.openxmlformats.org/drawingml/2006/main" noChangeAspect="1"/>
-            </wp:cNvGraphicFramePr>
-            <a:graphic xmlns:a="http://schemas.openxmlformats.org/drawingml/2006/main">
-              <a:graphicData uri="http://schemas.openxmlformats.org/drawingml/2006/picture">
-                <pic:pic xmlns:pic="http://schemas.openxmlformats.org/drawingml/2006/picture">
-                  <pic:nvPicPr>
-                    <pic:cNvPr id="360484274" name="Picture 5" descr="A screenshot of a computer&#10;&#10;AI-generated content may be incorrect."/>
-                    <pic:cNvPicPr/>
-                  </pic:nvPicPr>
-                  <pic:blipFill>
-                    <a:blip r:embed="rId10" cstate="print">
-                      <a:extLst>
-                        <a:ext uri="{28A0092B-C50C-407E-A947-70E740481C1C}">
-                          <a14:useLocalDpi xmlns:a14="http://schemas.microsoft.com/office/drawing/2010/main" val="0"/>
-                        </a:ext>
-                      </a:extLst>
-                    </a:blip>
-                    <a:stretch>
-                      <a:fillRect/>
-                    </a:stretch>
-                  </pic:blipFill>
-                  <pic:spPr>
-                    <a:xfrm>
-                      <a:off x="0" y="0"/>
-                      <a:ext cx="5943600" cy="2310130"/>
-                    </a:xfrm>
-                    <a:prstGeom prst="rect">
-                      <a:avLst/>
-                    </a:prstGeom>
-                  </pic:spPr>
-                </pic:pic>
-              </a:graphicData>
-            </a:graphic>
-          </wp:inline>
-        </w:drawing>
-      </w:r>
     </w:p>
     <w:p>
       <w:pPr>
@@ -1336,7 +1375,10 @@
         </w:numPr>
         <w:spacing w:before="100" w:beforeAutospacing="1" w:after="100" w:afterAutospacing="1" w:line="240" w:lineRule="auto"/>
         <w:rPr>
+          <w:rStyle w:val="Strong"/>
           <w:rFonts w:ascii="Times New Roman" w:eastAsia="Times New Roman" w:hAnsi="Times New Roman" w:cs="Times New Roman"/>
+          <w:b w:val="0"/>
+          <w:bCs w:val="0"/>
           <w:kern w:val="0"/>
           <w14:ligatures w14:val="none"/>
         </w:rPr>
@@ -1381,14 +1423,7 @@
         <w:rPr>
           <w:rFonts w:ascii="Times New Roman" w:hAnsi="Times New Roman" w:cs="Times New Roman"/>
         </w:rPr>
-        <w:t xml:space="preserve">If you are unable to complete this step successfully, no worries—we can work through it together during the </w:t>
-      </w:r>
-      <w:r>
-        <w:rPr>
-          <w:rFonts w:ascii="Times New Roman" w:hAnsi="Times New Roman" w:cs="Times New Roman"/>
-        </w:rPr>
-        <w:lastRenderedPageBreak/>
-        <w:t>workshop.</w:t>
+        <w:t>If you are unable to complete this step successfully, no worries—we can work through it together during the workshop.</w:t>
       </w:r>
       <w:r>
         <w:rPr>
@@ -1445,30 +1480,19 @@
         <w:rPr>
           <w:rStyle w:val="Strong"/>
           <w:rFonts w:eastAsiaTheme="majorEastAsia"/>
-        </w:rPr>
-      </w:pPr>
-    </w:p>
-    <w:p>
-      <w:pPr>
-        <w:pStyle w:val="NormalWeb"/>
+          <w:sz w:val="28"/>
+          <w:szCs w:val="28"/>
+        </w:rPr>
+      </w:pPr>
+      <w:r>
         <w:rPr>
           <w:rStyle w:val="Strong"/>
           <w:rFonts w:eastAsiaTheme="majorEastAsia"/>
-        </w:rPr>
-      </w:pPr>
-      <w:r>
-        <w:rPr>
-          <w:rStyle w:val="Strong"/>
-          <w:rFonts w:eastAsiaTheme="majorEastAsia"/>
-        </w:rPr>
-        <w:t>In-</w:t>
-      </w:r>
-      <w:r>
-        <w:rPr>
-          <w:rStyle w:val="Strong"/>
-          <w:rFonts w:eastAsiaTheme="majorEastAsia"/>
-        </w:rPr>
-        <w:t>Workshop Instructions</w:t>
+          <w:sz w:val="28"/>
+          <w:szCs w:val="28"/>
+        </w:rPr>
+        <w:lastRenderedPageBreak/>
+        <w:t>In-Workshop Instructions</w:t>
       </w:r>
     </w:p>
     <w:p>
@@ -1487,17 +1511,7 @@
           <w:kern w:val="2"/>
           <w14:ligatures w14:val="standardContextual"/>
         </w:rPr>
-        <w:t>Spatial Autocorrelation</w:t>
-      </w:r>
-      <w:r>
-        <w:rPr>
-          <w:rFonts w:eastAsiaTheme="minorEastAsia"/>
-          <w:b/>
-          <w:bCs/>
-          <w:kern w:val="2"/>
-          <w14:ligatures w14:val="standardContextual"/>
-        </w:rPr>
-        <w:t>.</w:t>
+        <w:t>Spatial Autocorrelation.</w:t>
       </w:r>
       <w:r>
         <w:rPr>
@@ -1910,7 +1924,6 @@
         <w:rPr>
           <w:rFonts w:ascii="Times New Roman" w:hAnsi="Times New Roman" w:cs="Times New Roman"/>
         </w:rPr>
-        <w:lastRenderedPageBreak/>
         <w:t>Reads the county shapefile.</w:t>
       </w:r>
     </w:p>
@@ -2171,6 +2184,7 @@
         <w:rPr>
           <w:rFonts w:ascii="Times New Roman" w:hAnsi="Times New Roman" w:cs="Times New Roman"/>
         </w:rPr>
+        <w:lastRenderedPageBreak/>
         <w:t>Creates </w:t>
       </w:r>
       <w:proofErr w:type="spellStart"/>
@@ -2571,7 +2585,6 @@
         <w:rPr>
           <w:rFonts w:ascii="Times New Roman" w:hAnsi="Times New Roman" w:cs="Times New Roman"/>
         </w:rPr>
-        <w:lastRenderedPageBreak/>
         <w:t>Stores local statistic values and p-values.</w:t>
       </w:r>
     </w:p>
@@ -2751,6 +2764,33 @@
         </w:rPr>
         <w:t>.</w:t>
       </w:r>
+    </w:p>
+    <w:p>
+      <w:pPr>
+        <w:shd w:val="clear" w:color="auto" w:fill="FFFFFF"/>
+        <w:spacing w:before="100" w:beforeAutospacing="1" w:after="100" w:afterAutospacing="1" w:line="240" w:lineRule="auto"/>
+        <w:rPr>
+          <w:rFonts w:ascii="Times New Roman" w:hAnsi="Times New Roman" w:cs="Times New Roman"/>
+        </w:rPr>
+      </w:pPr>
+    </w:p>
+    <w:p>
+      <w:pPr>
+        <w:shd w:val="clear" w:color="auto" w:fill="FFFFFF"/>
+        <w:spacing w:before="100" w:beforeAutospacing="1" w:after="100" w:afterAutospacing="1" w:line="240" w:lineRule="auto"/>
+        <w:rPr>
+          <w:rFonts w:ascii="Times New Roman" w:hAnsi="Times New Roman" w:cs="Times New Roman"/>
+        </w:rPr>
+      </w:pPr>
+    </w:p>
+    <w:p>
+      <w:pPr>
+        <w:shd w:val="clear" w:color="auto" w:fill="FFFFFF"/>
+        <w:spacing w:before="100" w:beforeAutospacing="1" w:after="100" w:afterAutospacing="1" w:line="240" w:lineRule="auto"/>
+        <w:rPr>
+          <w:rFonts w:ascii="Times New Roman" w:hAnsi="Times New Roman" w:cs="Times New Roman"/>
+        </w:rPr>
+      </w:pPr>
     </w:p>
     <w:p>
       <w:pPr>
@@ -2772,15 +2812,8 @@
           <w:b/>
           <w:bCs/>
         </w:rPr>
-        <w:t>Spatial Heterogeneity</w:t>
-      </w:r>
-      <w:r>
-        <w:rPr>
-          <w:rFonts w:ascii="Times New Roman" w:hAnsi="Times New Roman" w:cs="Times New Roman"/>
-          <w:b/>
-          <w:bCs/>
-        </w:rPr>
-        <w:t>.</w:t>
+        <w:lastRenderedPageBreak/>
+        <w:t>Spatial Heterogeneity.</w:t>
       </w:r>
       <w:r>
         <w:rPr>
@@ -2846,19 +2879,7 @@
         <w:rPr>
           <w:rFonts w:ascii="Times New Roman" w:hAnsi="Times New Roman" w:cs="Times New Roman"/>
         </w:rPr>
-        <w:t xml:space="preserve">A. Setup </w:t>
-      </w:r>
-      <w:r>
-        <w:rPr>
-          <w:rFonts w:ascii="Times New Roman" w:hAnsi="Times New Roman" w:cs="Times New Roman"/>
-        </w:rPr>
-        <w:t>and</w:t>
-      </w:r>
-      <w:r>
-        <w:rPr>
-          <w:rFonts w:ascii="Times New Roman" w:hAnsi="Times New Roman" w:cs="Times New Roman"/>
-        </w:rPr>
-        <w:t xml:space="preserve"> Inputs</w:t>
+        <w:t>A. Setup and Inputs</w:t>
       </w:r>
     </w:p>
     <w:p>
@@ -3271,7 +3292,6 @@
         <w:rPr>
           <w:rFonts w:ascii="Times New Roman" w:hAnsi="Times New Roman" w:cs="Times New Roman"/>
         </w:rPr>
-        <w:lastRenderedPageBreak/>
         <w:t>Drops counties missing required predictor data.</w:t>
       </w:r>
     </w:p>
@@ -3465,6 +3485,7 @@
         <w:rPr>
           <w:rFonts w:ascii="Times New Roman" w:hAnsi="Times New Roman" w:cs="Times New Roman"/>
         </w:rPr>
+        <w:lastRenderedPageBreak/>
         <w:t>Uses bandwidth selection to choose an adaptive neighborhood size.</w:t>
       </w:r>
     </w:p>
@@ -3852,15 +3873,6 @@
         </w:rPr>
         <w:t>Saves the local R² map as PNG.</w:t>
       </w:r>
-    </w:p>
-    <w:p>
-      <w:pPr>
-        <w:shd w:val="clear" w:color="auto" w:fill="FFFFFF"/>
-        <w:spacing w:before="100" w:beforeAutospacing="1" w:after="100" w:afterAutospacing="1" w:line="240" w:lineRule="auto"/>
-        <w:rPr>
-          <w:rFonts w:ascii="Times New Roman" w:hAnsi="Times New Roman" w:cs="Times New Roman"/>
-        </w:rPr>
-      </w:pPr>
     </w:p>
     <w:p>
       <w:pPr>
@@ -3900,7 +3912,6 @@
           <w:b/>
           <w:bCs/>
         </w:rPr>
-        <w:lastRenderedPageBreak/>
         <w:t>Spatial Clustering.</w:t>
       </w:r>
       <w:r>
@@ -4179,6 +4190,7 @@
         <w:rPr>
           <w:rFonts w:ascii="Times New Roman" w:hAnsi="Times New Roman" w:cs="Times New Roman"/>
         </w:rPr>
+        <w:lastRenderedPageBreak/>
         <w:t>B. Load OHCA Event Points</w:t>
       </w:r>
     </w:p>
@@ -4646,7 +4658,6 @@
         <w:rPr>
           <w:rFonts w:ascii="Times New Roman" w:hAnsi="Times New Roman" w:cs="Times New Roman"/>
         </w:rPr>
-        <w:lastRenderedPageBreak/>
         <w:t>Requires at least 10 nearby points to form a cluster.</w:t>
       </w:r>
     </w:p>
@@ -4739,19 +4750,7 @@
         <w:rPr>
           <w:rFonts w:ascii="Times New Roman" w:hAnsi="Times New Roman" w:cs="Times New Roman"/>
         </w:rPr>
-        <w:t xml:space="preserve">G. DBSCAN Mapping </w:t>
-      </w:r>
-      <w:r>
-        <w:rPr>
-          <w:rFonts w:ascii="Times New Roman" w:hAnsi="Times New Roman" w:cs="Times New Roman"/>
-        </w:rPr>
-        <w:t>and</w:t>
-      </w:r>
-      <w:r>
-        <w:rPr>
-          <w:rFonts w:ascii="Times New Roman" w:hAnsi="Times New Roman" w:cs="Times New Roman"/>
-        </w:rPr>
-        <w:t xml:space="preserve"> Summary</w:t>
+        <w:t>G. DBSCAN Mapping and Summary</w:t>
       </w:r>
     </w:p>
     <w:p>
@@ -4888,6 +4887,7 @@
         <w:rPr>
           <w:rFonts w:ascii="Times New Roman" w:hAnsi="Times New Roman" w:cs="Times New Roman"/>
         </w:rPr>
+        <w:lastRenderedPageBreak/>
         <w:t xml:space="preserve">Runs </w:t>
       </w:r>
       <w:proofErr w:type="spellStart"/>
@@ -5105,6 +5105,26 @@
     <w:p>
       <w:pPr>
         <w:shd w:val="clear" w:color="auto" w:fill="FFFFFF"/>
+        <w:spacing w:before="100" w:beforeAutospacing="1" w:after="100" w:afterAutospacing="1" w:line="240" w:lineRule="auto"/>
+        <w:ind w:left="720"/>
+        <w:rPr>
+          <w:rFonts w:ascii="Times New Roman" w:hAnsi="Times New Roman" w:cs="Times New Roman"/>
+        </w:rPr>
+      </w:pPr>
+    </w:p>
+    <w:p>
+      <w:pPr>
+        <w:shd w:val="clear" w:color="auto" w:fill="FFFFFF"/>
+        <w:spacing w:before="100" w:beforeAutospacing="1" w:after="100" w:afterAutospacing="1" w:line="240" w:lineRule="auto"/>
+        <w:ind w:left="720"/>
+        <w:rPr>
+          <w:rFonts w:ascii="Times New Roman" w:hAnsi="Times New Roman" w:cs="Times New Roman"/>
+        </w:rPr>
+      </w:pPr>
+    </w:p>
+    <w:p>
+      <w:pPr>
+        <w:shd w:val="clear" w:color="auto" w:fill="FFFFFF"/>
         <w:spacing w:before="300" w:after="150" w:line="240" w:lineRule="auto"/>
         <w:outlineLvl w:val="1"/>
         <w:rPr>
@@ -5207,19 +5227,7 @@
         <w:rPr>
           <w:rFonts w:ascii="Times New Roman" w:hAnsi="Times New Roman" w:cs="Times New Roman"/>
         </w:rPr>
-        <w:t xml:space="preserve">A. Setup </w:t>
-      </w:r>
-      <w:r>
-        <w:rPr>
-          <w:rFonts w:ascii="Times New Roman" w:hAnsi="Times New Roman" w:cs="Times New Roman"/>
-        </w:rPr>
-        <w:t>and</w:t>
-      </w:r>
-      <w:r>
-        <w:rPr>
-          <w:rFonts w:ascii="Times New Roman" w:hAnsi="Times New Roman" w:cs="Times New Roman"/>
-        </w:rPr>
-        <w:t xml:space="preserve"> Data Paths</w:t>
+        <w:t>A. Setup and Data Paths</w:t>
       </w:r>
     </w:p>
     <w:p>
@@ -5478,7 +5486,6 @@
         <w:rPr>
           <w:rFonts w:ascii="Times New Roman" w:hAnsi="Times New Roman" w:cs="Times New Roman"/>
         </w:rPr>
-        <w:lastRenderedPageBreak/>
         <w:t>C. Keep Georgia Events</w:t>
       </w:r>
     </w:p>
@@ -5609,6 +5616,7 @@
         <w:rPr>
           <w:rFonts w:ascii="Times New Roman" w:hAnsi="Times New Roman" w:cs="Times New Roman"/>
         </w:rPr>
+        <w:lastRenderedPageBreak/>
         <w:t>Gets the bounding box around Georgia.</w:t>
       </w:r>
     </w:p>
@@ -6152,7 +6160,6 @@
         <w:rPr>
           <w:rFonts w:ascii="Times New Roman" w:hAnsi="Times New Roman" w:cs="Times New Roman"/>
         </w:rPr>
-        <w:lastRenderedPageBreak/>
         <w:t>Counts how many AEDs are within each event’s catchment.</w:t>
       </w:r>
     </w:p>
@@ -6316,6 +6323,7 @@
         <w:rPr>
           <w:rFonts w:ascii="Times New Roman" w:hAnsi="Times New Roman" w:cs="Times New Roman"/>
         </w:rPr>
+        <w:lastRenderedPageBreak/>
         <w:t>Maps county mean 2SFCA accessibility.</w:t>
       </w:r>
     </w:p>
@@ -19504,6 +19512,7 @@
   <w:style w:type="character" w:default="1" w:styleId="DefaultParagraphFont">
     <w:name w:val="Default Paragraph Font"/>
     <w:uiPriority w:val="1"/>
+    <w:semiHidden/>
     <w:unhideWhenUsed/>
   </w:style>
   <w:style w:type="table" w:default="1" w:styleId="TableNormal">

</xml_diff>